<commit_message>
add a comment for teaching in d5 f script
</commit_message>
<xml_diff>
--- a/Syllabus_Natural Language Processing with Bag of Words.docx
+++ b/Syllabus_Natural Language Processing with Bag of Words.docx
@@ -1,6 +1,6 @@
 
 <file path=word/document.xml><?xml version="1.0" encoding="utf-8"?>
-<w:document xmlns:wpc="http://schemas.microsoft.com/office/word/2010/wordprocessingCanvas" xmlns:cx="http://schemas.microsoft.com/office/drawing/2014/chartex" xmlns:cx1="http://schemas.microsoft.com/office/drawing/2015/9/8/chartex" xmlns:cx2="http://schemas.microsoft.com/office/drawing/2015/10/21/chartex" xmlns:cx3="http://schemas.microsoft.com/office/drawing/2016/5/9/chartex" xmlns:cx4="http://schemas.microsoft.com/office/drawing/2016/5/10/chartex" xmlns:cx5="http://schemas.microsoft.com/office/drawing/2016/5/11/chartex" xmlns:cx6="http://schemas.microsoft.com/office/drawing/2016/5/12/chartex" xmlns:cx7="http://schemas.microsoft.com/office/drawing/2016/5/13/chartex" xmlns:cx8="http://schemas.microsoft.com/office/drawing/2016/5/14/chartex" xmlns:mc="http://schemas.openxmlformats.org/markup-compatibility/2006" xmlns:aink="http://schemas.microsoft.com/office/drawing/2016/ink" xmlns:am3d="http://schemas.microsoft.com/office/drawing/2017/model3d" xmlns:o="urn:schemas-microsoft-com:office:office" xmlns:oel="http://schemas.microsoft.com/office/2019/extlst" xmlns:r="http://schemas.openxmlformats.org/officeDocument/2006/relationships" xmlns:m="http://schemas.openxmlformats.org/officeDocument/2006/math" xmlns:v="urn:schemas-microsoft-com:vml" xmlns:wp14="http://schemas.microsoft.com/office/word/2010/wordprocessingDrawing" xmlns:wp="http://schemas.openxmlformats.org/drawingml/2006/wordprocessingDrawing" xmlns:w10="urn:schemas-microsoft-com:office:word" xmlns:w="http://schemas.openxmlformats.org/wordprocessingml/2006/main" xmlns:w14="http://schemas.microsoft.com/office/word/2010/wordml" xmlns:w15="http://schemas.microsoft.com/office/word/2012/wordml" xmlns:w16cex="http://schemas.microsoft.com/office/word/2018/wordml/cex" xmlns:w16cid="http://schemas.microsoft.com/office/word/2016/wordml/cid" xmlns:w16="http://schemas.microsoft.com/office/word/2018/wordml" xmlns:w16sdtdh="http://schemas.microsoft.com/office/word/2020/wordml/sdtdatahash" xmlns:w16se="http://schemas.microsoft.com/office/word/2015/wordml/symex" xmlns:wpg="http://schemas.microsoft.com/office/word/2010/wordprocessingGroup" xmlns:wpi="http://schemas.microsoft.com/office/word/2010/wordprocessingInk" xmlns:wne="http://schemas.microsoft.com/office/word/2006/wordml" xmlns:wps="http://schemas.microsoft.com/office/word/2010/wordprocessingShape" mc:Ignorable="w14 w15 w16se w16cid w16 w16cex w16sdtdh wp14">
+<w:document xmlns:wpc="http://schemas.microsoft.com/office/word/2010/wordprocessingCanvas" xmlns:cx="http://schemas.microsoft.com/office/drawing/2014/chartex" xmlns:cx1="http://schemas.microsoft.com/office/drawing/2015/9/8/chartex" xmlns:cx2="http://schemas.microsoft.com/office/drawing/2015/10/21/chartex" xmlns:cx3="http://schemas.microsoft.com/office/drawing/2016/5/9/chartex" xmlns:cx4="http://schemas.microsoft.com/office/drawing/2016/5/10/chartex" xmlns:cx5="http://schemas.microsoft.com/office/drawing/2016/5/11/chartex" xmlns:cx6="http://schemas.microsoft.com/office/drawing/2016/5/12/chartex" xmlns:cx7="http://schemas.microsoft.com/office/drawing/2016/5/13/chartex" xmlns:cx8="http://schemas.microsoft.com/office/drawing/2016/5/14/chartex" xmlns:mc="http://schemas.openxmlformats.org/markup-compatibility/2006" xmlns:aink="http://schemas.microsoft.com/office/drawing/2016/ink" xmlns:am3d="http://schemas.microsoft.com/office/drawing/2017/model3d" xmlns:o="urn:schemas-microsoft-com:office:office" xmlns:oel="http://schemas.microsoft.com/office/2019/extlst" xmlns:r="http://schemas.openxmlformats.org/officeDocument/2006/relationships" xmlns:m="http://schemas.openxmlformats.org/officeDocument/2006/math" xmlns:v="urn:schemas-microsoft-com:vml" xmlns:wp14="http://schemas.microsoft.com/office/word/2010/wordprocessingDrawing" xmlns:wp="http://schemas.openxmlformats.org/drawingml/2006/wordprocessingDrawing" xmlns:w10="urn:schemas-microsoft-com:office:word" xmlns:w="http://schemas.openxmlformats.org/wordprocessingml/2006/main" xmlns:w14="http://schemas.microsoft.com/office/word/2010/wordml" xmlns:w15="http://schemas.microsoft.com/office/word/2012/wordml" xmlns:w16cex="http://schemas.microsoft.com/office/word/2018/wordml/cex" xmlns:w16cid="http://schemas.microsoft.com/office/word/2016/wordml/cid" xmlns:w16="http://schemas.microsoft.com/office/word/2018/wordml" xmlns:w16du="http://schemas.microsoft.com/office/word/2023/wordml/word16du" xmlns:w16sdtdh="http://schemas.microsoft.com/office/word/2020/wordml/sdtdatahash" xmlns:w16sdtfl="http://schemas.microsoft.com/office/word/2024/wordml/sdtformatlock" xmlns:w16se="http://schemas.microsoft.com/office/word/2015/wordml/symex" xmlns:wpg="http://schemas.microsoft.com/office/word/2010/wordprocessingGroup" xmlns:wpi="http://schemas.microsoft.com/office/word/2010/wordprocessingInk" xmlns:wne="http://schemas.microsoft.com/office/word/2006/wordml" xmlns:wps="http://schemas.microsoft.com/office/word/2010/wordprocessingShape" mc:Ignorable="w14 w15 w16se w16cid w16 w16cex w16sdtdh w16sdtfl w16du wp14">
   <w:body>
     <w:p>
       <w:pPr>
@@ -469,7 +469,31 @@
           <w:lang w:eastAsia="de-CH"/>
           <w14:ligatures w14:val="none"/>
         </w:rPr>
-        <w:t>Bag-of-</w:t>
+        <w:t>Bag-</w:t>
+      </w:r>
+      <w:proofErr w:type="spellStart"/>
+      <w:r>
+        <w:rPr>
+          <w:rFonts w:ascii="Times New Roman" w:eastAsia="Times New Roman" w:hAnsi="Times New Roman" w:cs="Times New Roman"/>
+          <w:kern w:val="0"/>
+          <w:sz w:val="24"/>
+          <w:szCs w:val="24"/>
+          <w:lang w:eastAsia="de-CH"/>
+          <w14:ligatures w14:val="none"/>
+        </w:rPr>
+        <w:t>of</w:t>
+      </w:r>
+      <w:proofErr w:type="spellEnd"/>
+      <w:r>
+        <w:rPr>
+          <w:rFonts w:ascii="Times New Roman" w:eastAsia="Times New Roman" w:hAnsi="Times New Roman" w:cs="Times New Roman"/>
+          <w:kern w:val="0"/>
+          <w:sz w:val="24"/>
+          <w:szCs w:val="24"/>
+          <w:lang w:eastAsia="de-CH"/>
+          <w14:ligatures w14:val="none"/>
+        </w:rPr>
+        <w:t>-</w:t>
       </w:r>
       <w:proofErr w:type="spellStart"/>
       <w:r>
@@ -1376,23 +1400,8 @@
           <w:lang w:val="en-US" w:eastAsia="de-CH"/>
           <w14:ligatures w14:val="none"/>
         </w:rPr>
-        <w:t xml:space="preserve">Day 2: Visualizations in text </w:t>
-      </w:r>
-      <w:proofErr w:type="gramStart"/>
-      <w:r>
-        <w:rPr>
-          <w:rFonts w:ascii="Times New Roman" w:eastAsia="Times New Roman" w:hAnsi="Times New Roman" w:cs="Times New Roman"/>
-          <w:i/>
-          <w:iCs/>
-          <w:kern w:val="0"/>
-          <w:sz w:val="24"/>
-          <w:szCs w:val="24"/>
-          <w:lang w:val="en-US" w:eastAsia="de-CH"/>
-          <w14:ligatures w14:val="none"/>
-        </w:rPr>
-        <w:t>mining</w:t>
-      </w:r>
-      <w:proofErr w:type="gramEnd"/>
+        <w:t>Day 2: Visualizations in text mining</w:t>
+      </w:r>
     </w:p>
     <w:p>
       <w:pPr>
@@ -1588,21 +1597,8 @@
           <w:lang w:val="en-US" w:eastAsia="de-CH"/>
           <w14:ligatures w14:val="none"/>
         </w:rPr>
-        <w:t xml:space="preserve">Lab Section: Create various visualizations with news </w:t>
-      </w:r>
-      <w:proofErr w:type="gramStart"/>
-      <w:r>
-        <w:rPr>
-          <w:rFonts w:ascii="Times New Roman" w:eastAsia="Times New Roman" w:hAnsi="Times New Roman" w:cs="Times New Roman"/>
-          <w:kern w:val="0"/>
-          <w:sz w:val="24"/>
-          <w:szCs w:val="24"/>
-          <w:lang w:val="en-US" w:eastAsia="de-CH"/>
-          <w14:ligatures w14:val="none"/>
-        </w:rPr>
-        <w:t>articles</w:t>
-      </w:r>
-      <w:proofErr w:type="gramEnd"/>
+        <w:t>Lab Section: Create various visualizations with news articles</w:t>
+      </w:r>
     </w:p>
     <w:p>
       <w:pPr>
@@ -1846,21 +1842,8 @@
           <w:lang w:val="en-US" w:eastAsia="de-CH"/>
           <w14:ligatures w14:val="none"/>
         </w:rPr>
-        <w:t xml:space="preserve">Lab Section: Classify clickbait from news headlines, group news articles by </w:t>
-      </w:r>
-      <w:proofErr w:type="gramStart"/>
-      <w:r>
-        <w:rPr>
-          <w:rFonts w:ascii="Times New Roman" w:eastAsia="Times New Roman" w:hAnsi="Times New Roman" w:cs="Times New Roman"/>
-          <w:kern w:val="0"/>
-          <w:sz w:val="24"/>
-          <w:szCs w:val="24"/>
-          <w:lang w:val="en-US" w:eastAsia="de-CH"/>
-          <w14:ligatures w14:val="none"/>
-        </w:rPr>
-        <w:t>clusters</w:t>
-      </w:r>
-      <w:proofErr w:type="gramEnd"/>
+        <w:t>Lab Section: Classify clickbait from news headlines, group news articles by clusters</w:t>
+      </w:r>
     </w:p>
     <w:p>
       <w:pPr>
@@ -1904,29 +1887,16 @@
           <w14:ligatures w14:val="none"/>
         </w:rPr>
       </w:pPr>
-      <w:proofErr w:type="spellStart"/>
-      <w:r>
-        <w:rPr>
-          <w:rFonts w:ascii="Times New Roman" w:eastAsia="Times New Roman" w:hAnsi="Times New Roman" w:cs="Times New Roman"/>
-          <w:kern w:val="0"/>
-          <w:sz w:val="24"/>
-          <w:szCs w:val="24"/>
-          <w:lang w:eastAsia="de-CH"/>
-          <w14:ligatures w14:val="none"/>
-        </w:rPr>
-        <w:t>How</w:t>
-      </w:r>
-      <w:proofErr w:type="spellEnd"/>
-      <w:r>
-        <w:rPr>
-          <w:rFonts w:ascii="Times New Roman" w:eastAsia="Times New Roman" w:hAnsi="Times New Roman" w:cs="Times New Roman"/>
-          <w:kern w:val="0"/>
-          <w:sz w:val="24"/>
-          <w:szCs w:val="24"/>
-          <w:lang w:eastAsia="de-CH"/>
-          <w14:ligatures w14:val="none"/>
-        </w:rPr>
-        <w:t xml:space="preserve"> do LLMs </w:t>
+      <w:r>
+        <w:rPr>
+          <w:rFonts w:ascii="Times New Roman" w:eastAsia="Times New Roman" w:hAnsi="Times New Roman" w:cs="Times New Roman"/>
+          <w:kern w:val="0"/>
+          <w:sz w:val="24"/>
+          <w:szCs w:val="24"/>
+          <w:lang w:eastAsia="de-CH"/>
+          <w14:ligatures w14:val="none"/>
+        </w:rPr>
+        <w:t xml:space="preserve">How do LLMs </w:t>
       </w:r>
       <w:proofErr w:type="spellStart"/>
       <w:r>
@@ -2236,21 +2206,8 @@
           <w14:ligatures w14:val="none"/>
         </w:rPr>
         <w:lastRenderedPageBreak/>
-        <w:t xml:space="preserve">Lab Section: Using an LLMs to classify clickbait from news headlines, group news articles by clusters and compare to Day 3’s lab </w:t>
-      </w:r>
-      <w:proofErr w:type="gramStart"/>
-      <w:r>
-        <w:rPr>
-          <w:rFonts w:ascii="Times New Roman" w:eastAsia="Times New Roman" w:hAnsi="Times New Roman" w:cs="Times New Roman"/>
-          <w:kern w:val="0"/>
-          <w:sz w:val="24"/>
-          <w:szCs w:val="24"/>
-          <w:lang w:val="en-US" w:eastAsia="de-CH"/>
-          <w14:ligatures w14:val="none"/>
-        </w:rPr>
-        <w:t>results</w:t>
-      </w:r>
-      <w:proofErr w:type="gramEnd"/>
+        <w:t>Lab Section: Using an LLMs to classify clickbait from news headlines, group news articles by clusters and compare to Day 3’s lab results</w:t>
+      </w:r>
     </w:p>
     <w:p>
       <w:pPr>
@@ -2786,31 +2743,7 @@
           <w:lang w:val="en-US" w:eastAsia="de-CH"/>
           <w14:ligatures w14:val="none"/>
         </w:rPr>
-        <w:t xml:space="preserve">Read chapter 1 of Text Mining in </w:t>
-      </w:r>
-      <w:proofErr w:type="spellStart"/>
-      <w:r>
-        <w:rPr>
-          <w:rFonts w:ascii="Times New Roman" w:eastAsia="Times New Roman" w:hAnsi="Times New Roman" w:cs="Times New Roman"/>
-          <w:kern w:val="0"/>
-          <w:sz w:val="24"/>
-          <w:szCs w:val="24"/>
-          <w:lang w:val="en-US" w:eastAsia="de-CH"/>
-          <w14:ligatures w14:val="none"/>
-        </w:rPr>
-        <w:t>Practive</w:t>
-      </w:r>
-      <w:proofErr w:type="spellEnd"/>
-      <w:r>
-        <w:rPr>
-          <w:rFonts w:ascii="Times New Roman" w:eastAsia="Times New Roman" w:hAnsi="Times New Roman" w:cs="Times New Roman"/>
-          <w:kern w:val="0"/>
-          <w:sz w:val="24"/>
-          <w:szCs w:val="24"/>
-          <w:lang w:val="en-US" w:eastAsia="de-CH"/>
-          <w14:ligatures w14:val="none"/>
-        </w:rPr>
-        <w:t xml:space="preserve"> with R entitled “What is Text Mining?”</w:t>
+        <w:t>Read chapter 1 of Text Mining in Practive with R entitled “What is Text Mining?”</w:t>
       </w:r>
     </w:p>
     <w:p>
@@ -2997,19 +2930,59 @@
     </w:p>
     <w:p>
       <w:pPr>
-        <w:spacing w:before="100" w:beforeAutospacing="1" w:after="100" w:afterAutospacing="1" w:line="240" w:lineRule="auto"/>
-        <w:rPr>
-          <w:rFonts w:ascii="Times New Roman" w:eastAsia="Times New Roman" w:hAnsi="Times New Roman" w:cs="Times New Roman"/>
-          <w:kern w:val="0"/>
-          <w:sz w:val="24"/>
-          <w:szCs w:val="24"/>
-          <w:lang w:val="en-US" w:eastAsia="de-CH"/>
-          <w14:ligatures w14:val="none"/>
-        </w:rPr>
-      </w:pPr>
-      <w:r>
-        <w:rPr>
-          <w:rFonts w:ascii="Times New Roman" w:eastAsia="Times New Roman" w:hAnsi="Times New Roman" w:cs="Times New Roman"/>
+        <w:numPr>
+          <w:ilvl w:val="0"/>
+          <w:numId w:val="11"/>
+        </w:numPr>
+        <w:spacing w:before="100" w:beforeAutospacing="1" w:after="100" w:afterAutospacing="1" w:line="240" w:lineRule="auto"/>
+        <w:rPr>
+          <w:rFonts w:ascii="Times New Roman" w:eastAsia="Times New Roman" w:hAnsi="Times New Roman" w:cs="Times New Roman"/>
+          <w:b/>
+          <w:bCs/>
+          <w:kern w:val="0"/>
+          <w:sz w:val="24"/>
+          <w:szCs w:val="24"/>
+          <w:lang w:val="en-US" w:eastAsia="de-CH"/>
+          <w14:ligatures w14:val="none"/>
+        </w:rPr>
+      </w:pPr>
+      <w:r>
+        <w:rPr>
+          <w:rFonts w:ascii="Times New Roman" w:eastAsia="Times New Roman" w:hAnsi="Times New Roman" w:cs="Times New Roman"/>
+          <w:b/>
+          <w:bCs/>
+          <w:kern w:val="0"/>
+          <w:sz w:val="24"/>
+          <w:szCs w:val="24"/>
+          <w:lang w:val="en-US" w:eastAsia="de-CH"/>
+          <w14:ligatures w14:val="none"/>
+        </w:rPr>
+        <w:t xml:space="preserve">Share the AI conversation used to create the paper if applicable.  </w:t>
+      </w:r>
+    </w:p>
+    <w:p>
+      <w:pPr>
+        <w:numPr>
+          <w:ilvl w:val="0"/>
+          <w:numId w:val="11"/>
+        </w:numPr>
+        <w:spacing w:before="100" w:beforeAutospacing="1" w:after="100" w:afterAutospacing="1" w:line="240" w:lineRule="auto"/>
+        <w:rPr>
+          <w:rFonts w:ascii="Times New Roman" w:eastAsia="Times New Roman" w:hAnsi="Times New Roman" w:cs="Times New Roman"/>
+          <w:b/>
+          <w:bCs/>
+          <w:kern w:val="0"/>
+          <w:sz w:val="24"/>
+          <w:szCs w:val="24"/>
+          <w:lang w:val="en-US" w:eastAsia="de-CH"/>
+          <w14:ligatures w14:val="none"/>
+        </w:rPr>
+      </w:pPr>
+      <w:r>
+        <w:rPr>
+          <w:rFonts w:ascii="Times New Roman" w:eastAsia="Times New Roman" w:hAnsi="Times New Roman" w:cs="Times New Roman"/>
+          <w:b/>
+          <w:bCs/>
           <w:kern w:val="0"/>
           <w:sz w:val="24"/>
           <w:szCs w:val="24"/>
@@ -3017,6 +2990,58 @@
           <w14:ligatures w14:val="none"/>
         </w:rPr>
         <w:lastRenderedPageBreak/>
+        <w:t xml:space="preserve">Note any shortcomings, validations, uplift needed and objections you may have to the AI output.  If using </w:t>
+      </w:r>
+      <w:proofErr w:type="gramStart"/>
+      <w:r>
+        <w:rPr>
+          <w:rFonts w:ascii="Times New Roman" w:eastAsia="Times New Roman" w:hAnsi="Times New Roman" w:cs="Times New Roman"/>
+          <w:b/>
+          <w:bCs/>
+          <w:kern w:val="0"/>
+          <w:sz w:val="24"/>
+          <w:szCs w:val="24"/>
+          <w:lang w:val="en-US" w:eastAsia="de-CH"/>
+          <w14:ligatures w14:val="none"/>
+        </w:rPr>
+        <w:t>AI</w:t>
+      </w:r>
+      <w:proofErr w:type="gramEnd"/>
+      <w:r>
+        <w:rPr>
+          <w:rFonts w:ascii="Times New Roman" w:eastAsia="Times New Roman" w:hAnsi="Times New Roman" w:cs="Times New Roman"/>
+          <w:b/>
+          <w:bCs/>
+          <w:kern w:val="0"/>
+          <w:sz w:val="24"/>
+          <w:szCs w:val="24"/>
+          <w:lang w:val="en-US" w:eastAsia="de-CH"/>
+          <w14:ligatures w14:val="none"/>
+        </w:rPr>
+        <w:t xml:space="preserve"> the goal is to show your cognition used in the prompt and on top of the AI output itself.</w:t>
+      </w:r>
+    </w:p>
+    <w:p>
+      <w:pPr>
+        <w:spacing w:before="100" w:beforeAutospacing="1" w:after="100" w:afterAutospacing="1" w:line="240" w:lineRule="auto"/>
+        <w:rPr>
+          <w:rFonts w:ascii="Times New Roman" w:eastAsia="Times New Roman" w:hAnsi="Times New Roman" w:cs="Times New Roman"/>
+          <w:kern w:val="0"/>
+          <w:sz w:val="24"/>
+          <w:szCs w:val="24"/>
+          <w:lang w:val="en-US" w:eastAsia="de-CH"/>
+          <w14:ligatures w14:val="none"/>
+        </w:rPr>
+      </w:pPr>
+      <w:r>
+        <w:rPr>
+          <w:rFonts w:ascii="Times New Roman" w:eastAsia="Times New Roman" w:hAnsi="Times New Roman" w:cs="Times New Roman"/>
+          <w:kern w:val="0"/>
+          <w:sz w:val="24"/>
+          <w:szCs w:val="24"/>
+          <w:lang w:val="en-US" w:eastAsia="de-CH"/>
+          <w14:ligatures w14:val="none"/>
+        </w:rPr>
         <w:t> </w:t>
       </w:r>
     </w:p>
@@ -3054,23 +3079,8 @@
           <w:lang w:val="en-US" w:eastAsia="de-CH"/>
           <w14:ligatures w14:val="none"/>
         </w:rPr>
-        <w:t xml:space="preserve">Proctored on the final day of the </w:t>
-      </w:r>
-      <w:proofErr w:type="gramStart"/>
-      <w:r>
-        <w:rPr>
-          <w:rFonts w:ascii="Times New Roman" w:eastAsia="Times New Roman" w:hAnsi="Times New Roman" w:cs="Times New Roman"/>
-          <w:i/>
-          <w:iCs/>
-          <w:kern w:val="0"/>
-          <w:sz w:val="24"/>
-          <w:szCs w:val="24"/>
-          <w:lang w:val="en-US" w:eastAsia="de-CH"/>
-          <w14:ligatures w14:val="none"/>
-        </w:rPr>
-        <w:t>week</w:t>
-      </w:r>
-      <w:proofErr w:type="gramEnd"/>
+        <w:t>Proctored on the final day of the week</w:t>
+      </w:r>
     </w:p>
     <w:p>
       <w:pPr>
@@ -3221,21 +3231,8 @@
           <w:lang w:val="en-US" w:eastAsia="de-CH"/>
           <w14:ligatures w14:val="none"/>
         </w:rPr>
-        <w:t xml:space="preserve"> specific code steps are being </w:t>
-      </w:r>
-      <w:proofErr w:type="gramStart"/>
-      <w:r>
-        <w:rPr>
-          <w:rFonts w:ascii="Times New Roman" w:eastAsia="Times New Roman" w:hAnsi="Times New Roman" w:cs="Times New Roman"/>
-          <w:kern w:val="0"/>
-          <w:sz w:val="24"/>
-          <w:szCs w:val="24"/>
-          <w:lang w:val="en-US" w:eastAsia="de-CH"/>
-          <w14:ligatures w14:val="none"/>
-        </w:rPr>
-        <w:t>taken</w:t>
-      </w:r>
-      <w:proofErr w:type="gramEnd"/>
+        <w:t xml:space="preserve"> specific code steps are being taken</w:t>
+      </w:r>
     </w:p>
     <w:p>
       <w:pPr>
@@ -3338,66 +3335,42 @@
           <w:lang w:val="en-US" w:eastAsia="de-CH"/>
           <w14:ligatures w14:val="none"/>
         </w:rPr>
-        <w:t xml:space="preserve">Students may bring a </w:t>
-      </w:r>
-      <w:proofErr w:type="gramStart"/>
-      <w:r>
-        <w:rPr>
-          <w:rFonts w:ascii="Times New Roman" w:eastAsia="Times New Roman" w:hAnsi="Times New Roman" w:cs="Times New Roman"/>
-          <w:kern w:val="0"/>
-          <w:sz w:val="24"/>
-          <w:szCs w:val="24"/>
-          <w:lang w:val="en-US" w:eastAsia="de-CH"/>
-          <w14:ligatures w14:val="none"/>
-        </w:rPr>
-        <w:t>hand written</w:t>
-      </w:r>
-      <w:proofErr w:type="gramEnd"/>
-      <w:r>
-        <w:rPr>
-          <w:rFonts w:ascii="Times New Roman" w:eastAsia="Times New Roman" w:hAnsi="Times New Roman" w:cs="Times New Roman"/>
-          <w:kern w:val="0"/>
-          <w:sz w:val="24"/>
-          <w:szCs w:val="24"/>
-          <w:lang w:val="en-US" w:eastAsia="de-CH"/>
-          <w14:ligatures w14:val="none"/>
-        </w:rPr>
-        <w:t xml:space="preserve"> “index card” to the final examination period. It may be double </w:t>
-      </w:r>
-      <w:proofErr w:type="gramStart"/>
-      <w:r>
-        <w:rPr>
-          <w:rFonts w:ascii="Times New Roman" w:eastAsia="Times New Roman" w:hAnsi="Times New Roman" w:cs="Times New Roman"/>
-          <w:kern w:val="0"/>
-          <w:sz w:val="24"/>
-          <w:szCs w:val="24"/>
-          <w:lang w:val="en-US" w:eastAsia="de-CH"/>
-          <w14:ligatures w14:val="none"/>
-        </w:rPr>
-        <w:t>sided, and</w:t>
-      </w:r>
-      <w:proofErr w:type="gramEnd"/>
-      <w:r>
-        <w:rPr>
-          <w:rFonts w:ascii="Times New Roman" w:eastAsia="Times New Roman" w:hAnsi="Times New Roman" w:cs="Times New Roman"/>
-          <w:kern w:val="0"/>
-          <w:sz w:val="24"/>
-          <w:szCs w:val="24"/>
-          <w:lang w:val="en-US" w:eastAsia="de-CH"/>
-          <w14:ligatures w14:val="none"/>
-        </w:rPr>
-        <w:t xml:space="preserve"> should be functionally equivalent to the UK standard 3in by 5in notecard. Students may put any information they deem important for the final on their notecard and use it as a supplement during the exam. </w:t>
-      </w:r>
-      <w:r>
-        <w:rPr>
-          <w:rFonts w:ascii="Times New Roman" w:eastAsia="Times New Roman" w:hAnsi="Times New Roman" w:cs="Times New Roman"/>
-          <w:kern w:val="0"/>
-          <w:sz w:val="24"/>
-          <w:szCs w:val="24"/>
-          <w:lang w:eastAsia="de-CH"/>
-          <w14:ligatures w14:val="none"/>
-        </w:rPr>
-        <w:t xml:space="preserve">Use of an </w:t>
+        <w:t xml:space="preserve">Students may bring a hand written “index card” to the final examination period. It may be double sided, and should be functionally equivalent to the UK standard 3in by 5in notecard. Students may put any information they deem important for the final on their notecard and use it as a supplement during the exam. </w:t>
+      </w:r>
+      <w:r>
+        <w:rPr>
+          <w:rFonts w:ascii="Times New Roman" w:eastAsia="Times New Roman" w:hAnsi="Times New Roman" w:cs="Times New Roman"/>
+          <w:kern w:val="0"/>
+          <w:sz w:val="24"/>
+          <w:szCs w:val="24"/>
+          <w:lang w:eastAsia="de-CH"/>
+          <w14:ligatures w14:val="none"/>
+        </w:rPr>
+        <w:t xml:space="preserve">Use </w:t>
+      </w:r>
+      <w:proofErr w:type="spellStart"/>
+      <w:r>
+        <w:rPr>
+          <w:rFonts w:ascii="Times New Roman" w:eastAsia="Times New Roman" w:hAnsi="Times New Roman" w:cs="Times New Roman"/>
+          <w:kern w:val="0"/>
+          <w:sz w:val="24"/>
+          <w:szCs w:val="24"/>
+          <w:lang w:eastAsia="de-CH"/>
+          <w14:ligatures w14:val="none"/>
+        </w:rPr>
+        <w:t>of</w:t>
+      </w:r>
+      <w:proofErr w:type="spellEnd"/>
+      <w:r>
+        <w:rPr>
+          <w:rFonts w:ascii="Times New Roman" w:eastAsia="Times New Roman" w:hAnsi="Times New Roman" w:cs="Times New Roman"/>
+          <w:kern w:val="0"/>
+          <w:sz w:val="24"/>
+          <w:szCs w:val="24"/>
+          <w:lang w:eastAsia="de-CH"/>
+          <w14:ligatures w14:val="none"/>
+        </w:rPr>
+        <w:t xml:space="preserve"> an </w:t>
       </w:r>
       <w:proofErr w:type="spellStart"/>
       <w:r>
@@ -3697,7 +3670,7 @@
 </file>
 
 <file path=word/numbering.xml><?xml version="1.0" encoding="utf-8"?>
-<w:numbering xmlns:wpc="http://schemas.microsoft.com/office/word/2010/wordprocessingCanvas" xmlns:cx="http://schemas.microsoft.com/office/drawing/2014/chartex" xmlns:cx1="http://schemas.microsoft.com/office/drawing/2015/9/8/chartex" xmlns:cx2="http://schemas.microsoft.com/office/drawing/2015/10/21/chartex" xmlns:cx3="http://schemas.microsoft.com/office/drawing/2016/5/9/chartex" xmlns:cx4="http://schemas.microsoft.com/office/drawing/2016/5/10/chartex" xmlns:cx5="http://schemas.microsoft.com/office/drawing/2016/5/11/chartex" xmlns:cx6="http://schemas.microsoft.com/office/drawing/2016/5/12/chartex" xmlns:cx7="http://schemas.microsoft.com/office/drawing/2016/5/13/chartex" xmlns:cx8="http://schemas.microsoft.com/office/drawing/2016/5/14/chartex" xmlns:mc="http://schemas.openxmlformats.org/markup-compatibility/2006" xmlns:aink="http://schemas.microsoft.com/office/drawing/2016/ink" xmlns:am3d="http://schemas.microsoft.com/office/drawing/2017/model3d" xmlns:o="urn:schemas-microsoft-com:office:office" xmlns:oel="http://schemas.microsoft.com/office/2019/extlst" xmlns:r="http://schemas.openxmlformats.org/officeDocument/2006/relationships" xmlns:m="http://schemas.openxmlformats.org/officeDocument/2006/math" xmlns:v="urn:schemas-microsoft-com:vml" xmlns:wp14="http://schemas.microsoft.com/office/word/2010/wordprocessingDrawing" xmlns:wp="http://schemas.openxmlformats.org/drawingml/2006/wordprocessingDrawing" xmlns:w10="urn:schemas-microsoft-com:office:word" xmlns:w="http://schemas.openxmlformats.org/wordprocessingml/2006/main" xmlns:w14="http://schemas.microsoft.com/office/word/2010/wordml" xmlns:w15="http://schemas.microsoft.com/office/word/2012/wordml" xmlns:w16cex="http://schemas.microsoft.com/office/word/2018/wordml/cex" xmlns:w16cid="http://schemas.microsoft.com/office/word/2016/wordml/cid" xmlns:w16="http://schemas.microsoft.com/office/word/2018/wordml" xmlns:w16sdtdh="http://schemas.microsoft.com/office/word/2020/wordml/sdtdatahash" xmlns:w16se="http://schemas.microsoft.com/office/word/2015/wordml/symex" xmlns:wpg="http://schemas.microsoft.com/office/word/2010/wordprocessingGroup" xmlns:wpi="http://schemas.microsoft.com/office/word/2010/wordprocessingInk" xmlns:wne="http://schemas.microsoft.com/office/word/2006/wordml" xmlns:wps="http://schemas.microsoft.com/office/word/2010/wordprocessingShape" mc:Ignorable="w14 w15 w16se w16cid w16 w16cex w16sdtdh wp14">
+<w:numbering xmlns:wpc="http://schemas.microsoft.com/office/word/2010/wordprocessingCanvas" xmlns:cx="http://schemas.microsoft.com/office/drawing/2014/chartex" xmlns:cx1="http://schemas.microsoft.com/office/drawing/2015/9/8/chartex" xmlns:cx2="http://schemas.microsoft.com/office/drawing/2015/10/21/chartex" xmlns:cx3="http://schemas.microsoft.com/office/drawing/2016/5/9/chartex" xmlns:cx4="http://schemas.microsoft.com/office/drawing/2016/5/10/chartex" xmlns:cx5="http://schemas.microsoft.com/office/drawing/2016/5/11/chartex" xmlns:cx6="http://schemas.microsoft.com/office/drawing/2016/5/12/chartex" xmlns:cx7="http://schemas.microsoft.com/office/drawing/2016/5/13/chartex" xmlns:cx8="http://schemas.microsoft.com/office/drawing/2016/5/14/chartex" xmlns:mc="http://schemas.openxmlformats.org/markup-compatibility/2006" xmlns:aink="http://schemas.microsoft.com/office/drawing/2016/ink" xmlns:am3d="http://schemas.microsoft.com/office/drawing/2017/model3d" xmlns:o="urn:schemas-microsoft-com:office:office" xmlns:oel="http://schemas.microsoft.com/office/2019/extlst" xmlns:r="http://schemas.openxmlformats.org/officeDocument/2006/relationships" xmlns:m="http://schemas.openxmlformats.org/officeDocument/2006/math" xmlns:v="urn:schemas-microsoft-com:vml" xmlns:wp14="http://schemas.microsoft.com/office/word/2010/wordprocessingDrawing" xmlns:wp="http://schemas.openxmlformats.org/drawingml/2006/wordprocessingDrawing" xmlns:w10="urn:schemas-microsoft-com:office:word" xmlns:w="http://schemas.openxmlformats.org/wordprocessingml/2006/main" xmlns:w14="http://schemas.microsoft.com/office/word/2010/wordml" xmlns:w15="http://schemas.microsoft.com/office/word/2012/wordml" xmlns:w16cex="http://schemas.microsoft.com/office/word/2018/wordml/cex" xmlns:w16cid="http://schemas.microsoft.com/office/word/2016/wordml/cid" xmlns:w16="http://schemas.microsoft.com/office/word/2018/wordml" xmlns:w16du="http://schemas.microsoft.com/office/word/2023/wordml/word16du" xmlns:w16sdtdh="http://schemas.microsoft.com/office/word/2020/wordml/sdtdatahash" xmlns:w16sdtfl="http://schemas.microsoft.com/office/word/2024/wordml/sdtformatlock" xmlns:w16se="http://schemas.microsoft.com/office/word/2015/wordml/symex" xmlns:wpg="http://schemas.microsoft.com/office/word/2010/wordprocessingGroup" xmlns:wpi="http://schemas.microsoft.com/office/word/2010/wordprocessingInk" xmlns:wne="http://schemas.microsoft.com/office/word/2006/wordml" xmlns:wps="http://schemas.microsoft.com/office/word/2010/wordprocessingShape" mc:Ignorable="w14 w15 w16se w16cid w16 w16cex w16sdtdh w16sdtfl w16du wp14">
   <w:abstractNum w:abstractNumId="0" w15:restartNumberingAfterBreak="0">
     <w:nsid w:val="0D6512E2"/>
     <w:multiLevelType w:val="multilevel"/>
@@ -5526,7 +5499,7 @@
 </file>
 
 <file path=word/styles.xml><?xml version="1.0" encoding="utf-8"?>
-<w:styles xmlns:mc="http://schemas.openxmlformats.org/markup-compatibility/2006" xmlns:r="http://schemas.openxmlformats.org/officeDocument/2006/relationships" xmlns:w="http://schemas.openxmlformats.org/wordprocessingml/2006/main" xmlns:w14="http://schemas.microsoft.com/office/word/2010/wordml" xmlns:w15="http://schemas.microsoft.com/office/word/2012/wordml" xmlns:w16cex="http://schemas.microsoft.com/office/word/2018/wordml/cex" xmlns:w16cid="http://schemas.microsoft.com/office/word/2016/wordml/cid" xmlns:w16="http://schemas.microsoft.com/office/word/2018/wordml" xmlns:w16sdtdh="http://schemas.microsoft.com/office/word/2020/wordml/sdtdatahash" xmlns:w16se="http://schemas.microsoft.com/office/word/2015/wordml/symex" mc:Ignorable="w14 w15 w16se w16cid w16 w16cex w16sdtdh">
+<w:styles xmlns:mc="http://schemas.openxmlformats.org/markup-compatibility/2006" xmlns:r="http://schemas.openxmlformats.org/officeDocument/2006/relationships" xmlns:w="http://schemas.openxmlformats.org/wordprocessingml/2006/main" xmlns:w14="http://schemas.microsoft.com/office/word/2010/wordml" xmlns:w15="http://schemas.microsoft.com/office/word/2012/wordml" xmlns:w16cex="http://schemas.microsoft.com/office/word/2018/wordml/cex" xmlns:w16cid="http://schemas.microsoft.com/office/word/2016/wordml/cid" xmlns:w16="http://schemas.microsoft.com/office/word/2018/wordml" xmlns:w16du="http://schemas.microsoft.com/office/word/2023/wordml/word16du" xmlns:w16sdtdh="http://schemas.microsoft.com/office/word/2020/wordml/sdtdatahash" xmlns:w16sdtfl="http://schemas.microsoft.com/office/word/2024/wordml/sdtformatlock" xmlns:w16se="http://schemas.microsoft.com/office/word/2015/wordml/symex" mc:Ignorable="w14 w15 w16se w16cid w16 w16cex w16sdtdh w16sdtfl w16du">
   <w:docDefaults>
     <w:rPrDefault>
       <w:rPr>
@@ -5922,15 +5895,15 @@
     <w:lsdException w:name="Unresolved Mention" w:semiHidden="1" w:unhideWhenUsed="1"/>
     <w:lsdException w:name="Smart Link" w:semiHidden="1" w:unhideWhenUsed="1"/>
   </w:latentStyles>
-  <w:style w:type="paragraph" w:default="1" w:styleId="Standard">
+  <w:style w:type="paragraph" w:default="1" w:styleId="Normal">
     <w:name w:val="Normal"/>
     <w:qFormat/>
   </w:style>
-  <w:style w:type="paragraph" w:styleId="berschrift1">
+  <w:style w:type="paragraph" w:styleId="Heading1">
     <w:name w:val="heading 1"/>
-    <w:basedOn w:val="Standard"/>
-    <w:next w:val="Standard"/>
-    <w:link w:val="berschrift1Zchn"/>
+    <w:basedOn w:val="Normal"/>
+    <w:next w:val="Normal"/>
+    <w:link w:val="Heading1Char"/>
     <w:uiPriority w:val="9"/>
     <w:qFormat/>
     <w:rsid w:val="003C7E37"/>
@@ -5947,13 +5920,13 @@
       <w:szCs w:val="32"/>
     </w:rPr>
   </w:style>
-  <w:style w:type="character" w:default="1" w:styleId="Absatz-Standardschriftart">
+  <w:style w:type="character" w:default="1" w:styleId="DefaultParagraphFont">
     <w:name w:val="Default Paragraph Font"/>
     <w:uiPriority w:val="1"/>
     <w:semiHidden/>
     <w:unhideWhenUsed/>
   </w:style>
-  <w:style w:type="table" w:default="1" w:styleId="NormaleTabelle">
+  <w:style w:type="table" w:default="1" w:styleId="TableNormal">
     <w:name w:val="Normal Table"/>
     <w:uiPriority w:val="99"/>
     <w:semiHidden/>
@@ -5968,16 +5941,16 @@
       </w:tblCellMar>
     </w:tblPr>
   </w:style>
-  <w:style w:type="numbering" w:default="1" w:styleId="KeineListe">
+  <w:style w:type="numbering" w:default="1" w:styleId="NoList">
     <w:name w:val="No List"/>
     <w:uiPriority w:val="99"/>
     <w:semiHidden/>
     <w:unhideWhenUsed/>
   </w:style>
-  <w:style w:type="character" w:customStyle="1" w:styleId="berschrift1Zchn">
-    <w:name w:val="Überschrift 1 Zchn"/>
-    <w:basedOn w:val="Absatz-Standardschriftart"/>
-    <w:link w:val="berschrift1"/>
+  <w:style w:type="character" w:customStyle="1" w:styleId="Heading1Char">
+    <w:name w:val="Heading 1 Char"/>
+    <w:basedOn w:val="DefaultParagraphFont"/>
+    <w:link w:val="Heading1"/>
     <w:uiPriority w:val="9"/>
     <w:rsid w:val="003C7E37"/>
     <w:rPr>
@@ -5987,9 +5960,9 @@
       <w:szCs w:val="32"/>
     </w:rPr>
   </w:style>
-  <w:style w:type="paragraph" w:styleId="StandardWeb">
+  <w:style w:type="paragraph" w:styleId="NormalWeb">
     <w:name w:val="Normal (Web)"/>
-    <w:basedOn w:val="Standard"/>
+    <w:basedOn w:val="Normal"/>
     <w:uiPriority w:val="99"/>
     <w:semiHidden/>
     <w:unhideWhenUsed/>
@@ -6006,9 +5979,9 @@
       <w14:ligatures w14:val="none"/>
     </w:rPr>
   </w:style>
-  <w:style w:type="character" w:styleId="Fett">
+  <w:style w:type="character" w:styleId="Strong">
     <w:name w:val="Strong"/>
-    <w:basedOn w:val="Absatz-Standardschriftart"/>
+    <w:basedOn w:val="DefaultParagraphFont"/>
     <w:uiPriority w:val="22"/>
     <w:qFormat/>
     <w:rsid w:val="006B41A5"/>
@@ -6017,9 +5990,9 @@
       <w:bCs/>
     </w:rPr>
   </w:style>
-  <w:style w:type="character" w:styleId="Hervorhebung">
+  <w:style w:type="character" w:styleId="Emphasis">
     <w:name w:val="Emphasis"/>
-    <w:basedOn w:val="Absatz-Standardschriftart"/>
+    <w:basedOn w:val="DefaultParagraphFont"/>
     <w:uiPriority w:val="20"/>
     <w:qFormat/>
     <w:rsid w:val="006B41A5"/>
@@ -6030,7 +6003,7 @@
   </w:style>
   <w:style w:type="character" w:styleId="Hyperlink">
     <w:name w:val="Hyperlink"/>
-    <w:basedOn w:val="Absatz-Standardschriftart"/>
+    <w:basedOn w:val="DefaultParagraphFont"/>
     <w:uiPriority w:val="99"/>
     <w:semiHidden/>
     <w:unhideWhenUsed/>

</xml_diff>